<commit_message>
На узлы установлены k8s v1.33, contanerd, nfs-server, nfs-client
</commit_message>
<xml_diff>
--- a/Homework_k8s.docx
+++ b/Homework_k8s.docx
@@ -780,6 +780,16 @@
         <w:jc w:val="center"/>
         <w:rPr>
           <w:rFonts w:ascii="Times New Roman" w:hAnsi="Times New Roman" w:cs="Times New Roman"/>
+          <w:sz w:val="20"/>
+          <w:szCs w:val="20"/>
+        </w:rPr>
+      </w:pPr>
+    </w:p>
+    <w:p>
+      <w:pPr>
+        <w:jc w:val="center"/>
+        <w:rPr>
+          <w:rFonts w:ascii="Times New Roman" w:hAnsi="Times New Roman" w:cs="Times New Roman"/>
           <w:sz w:val="28"/>
           <w:szCs w:val="28"/>
         </w:rPr>
@@ -1311,6 +1321,584 @@
           <w:rFonts w:ascii="Times New Roman" w:hAnsi="Times New Roman" w:cs="Times New Roman"/>
           <w:sz w:val="28"/>
           <w:szCs w:val="28"/>
+        </w:rPr>
+      </w:pPr>
+      <w:r>
+        <w:rPr>
+          <w:rFonts w:ascii="Times New Roman" w:hAnsi="Times New Roman" w:cs="Times New Roman"/>
+          <w:sz w:val="28"/>
+          <w:szCs w:val="28"/>
+        </w:rPr>
+        <w:tab/>
+        <w:t>Теперь приступим к установке утилит на узлы. Начнем</w:t>
+      </w:r>
+      <w:r>
+        <w:rPr>
+          <w:rFonts w:ascii="Times New Roman" w:hAnsi="Times New Roman" w:cs="Times New Roman"/>
+          <w:sz w:val="28"/>
+          <w:szCs w:val="28"/>
+          <w:lang w:val="en-US"/>
+        </w:rPr>
+        <w:t xml:space="preserve"> </w:t>
+      </w:r>
+      <w:r>
+        <w:rPr>
+          <w:rFonts w:ascii="Times New Roman" w:hAnsi="Times New Roman" w:cs="Times New Roman"/>
+          <w:sz w:val="28"/>
+          <w:szCs w:val="28"/>
+        </w:rPr>
+        <w:t>с</w:t>
+      </w:r>
+      <w:r>
+        <w:rPr>
+          <w:rFonts w:ascii="Times New Roman" w:hAnsi="Times New Roman" w:cs="Times New Roman"/>
+          <w:sz w:val="28"/>
+          <w:szCs w:val="28"/>
+          <w:lang w:val="en-US"/>
+        </w:rPr>
+        <w:t xml:space="preserve"> </w:t>
+      </w:r>
+      <w:r>
+        <w:rPr>
+          <w:rFonts w:ascii="Times New Roman" w:hAnsi="Times New Roman" w:cs="Times New Roman"/>
+          <w:sz w:val="28"/>
+          <w:szCs w:val="28"/>
+          <w:lang w:val="en-US"/>
+        </w:rPr>
+        <w:t xml:space="preserve">Container Runtime. </w:t>
+      </w:r>
+      <w:r>
+        <w:rPr>
+          <w:rFonts w:ascii="Times New Roman" w:hAnsi="Times New Roman" w:cs="Times New Roman"/>
+          <w:sz w:val="28"/>
+          <w:szCs w:val="28"/>
+          <w:lang w:val="en-US"/>
+        </w:rPr>
+        <w:t>Container</w:t>
+      </w:r>
+      <w:r>
+        <w:rPr>
+          <w:rFonts w:ascii="Times New Roman" w:hAnsi="Times New Roman" w:cs="Times New Roman"/>
+          <w:sz w:val="28"/>
+          <w:szCs w:val="28"/>
+        </w:rPr>
+        <w:t xml:space="preserve"> </w:t>
+      </w:r>
+      <w:r>
+        <w:rPr>
+          <w:rFonts w:ascii="Times New Roman" w:hAnsi="Times New Roman" w:cs="Times New Roman"/>
+          <w:sz w:val="28"/>
+          <w:szCs w:val="28"/>
+          <w:lang w:val="en-US"/>
+        </w:rPr>
+        <w:t>Runtime</w:t>
+      </w:r>
+      <w:r>
+        <w:rPr>
+          <w:rFonts w:ascii="Times New Roman" w:hAnsi="Times New Roman" w:cs="Times New Roman"/>
+          <w:sz w:val="28"/>
+          <w:szCs w:val="28"/>
+        </w:rPr>
+        <w:t xml:space="preserve"> — ПО, которое позволяет запускать и управлять контейнерами в системе. В качестве такого ПО, выберем </w:t>
+      </w:r>
+      <w:r>
+        <w:rPr>
+          <w:rFonts w:ascii="Times New Roman" w:hAnsi="Times New Roman" w:cs="Times New Roman"/>
+          <w:b/>
+          <w:bCs/>
+          <w:i/>
+          <w:iCs/>
+          <w:sz w:val="28"/>
+          <w:szCs w:val="28"/>
+          <w:lang w:val="en-US"/>
+        </w:rPr>
+        <w:t>containerd</w:t>
+      </w:r>
+      <w:r>
+        <w:rPr>
+          <w:rFonts w:ascii="Times New Roman" w:hAnsi="Times New Roman" w:cs="Times New Roman"/>
+          <w:sz w:val="28"/>
+          <w:szCs w:val="28"/>
+        </w:rPr>
+        <w:t xml:space="preserve">. </w:t>
+      </w:r>
+      <w:r>
+        <w:rPr>
+          <w:rFonts w:ascii="Times New Roman" w:hAnsi="Times New Roman" w:cs="Times New Roman"/>
+          <w:sz w:val="28"/>
+          <w:szCs w:val="28"/>
+        </w:rPr>
+        <w:t xml:space="preserve">После установки выполним настройку </w:t>
+      </w:r>
+      <w:r>
+        <w:rPr>
+          <w:rFonts w:ascii="Times New Roman" w:hAnsi="Times New Roman" w:cs="Times New Roman"/>
+          <w:sz w:val="28"/>
+          <w:szCs w:val="28"/>
+          <w:lang w:val="en-US"/>
+        </w:rPr>
+        <w:t>containerd</w:t>
+      </w:r>
+      <w:r>
+        <w:rPr>
+          <w:rFonts w:ascii="Times New Roman" w:hAnsi="Times New Roman" w:cs="Times New Roman"/>
+          <w:sz w:val="28"/>
+          <w:szCs w:val="28"/>
+        </w:rPr>
+        <w:t>:</w:t>
+      </w:r>
+    </w:p>
+    <w:p>
+      <w:pPr>
+        <w:jc w:val="both"/>
+        <w:rPr>
+          <w:rFonts w:ascii="Times New Roman" w:hAnsi="Times New Roman" w:cs="Times New Roman"/>
+          <w:sz w:val="28"/>
+          <w:szCs w:val="28"/>
+        </w:rPr>
+      </w:pPr>
+      <w:r>
+        <w:rPr>
+          <w:noProof/>
+        </w:rPr>
+        <w:drawing>
+          <wp:inline distT="0" distB="0" distL="0" distR="0" wp14:anchorId="73B4AF3A" wp14:editId="6CDC2CFC">
+            <wp:extent cx="5940425" cy="361315"/>
+            <wp:effectExtent l="0" t="0" r="3175" b="635"/>
+            <wp:docPr id="7" name="Рисунок 7"/>
+            <wp:cNvGraphicFramePr>
+              <a:graphicFrameLocks xmlns:a="http://schemas.openxmlformats.org/drawingml/2006/main" noChangeAspect="1"/>
+            </wp:cNvGraphicFramePr>
+            <a:graphic xmlns:a="http://schemas.openxmlformats.org/drawingml/2006/main">
+              <a:graphicData uri="http://schemas.openxmlformats.org/drawingml/2006/picture">
+                <pic:pic xmlns:pic="http://schemas.openxmlformats.org/drawingml/2006/picture">
+                  <pic:nvPicPr>
+                    <pic:cNvPr id="1" name=""/>
+                    <pic:cNvPicPr/>
+                  </pic:nvPicPr>
+                  <pic:blipFill>
+                    <a:blip r:embed="rId10"/>
+                    <a:stretch>
+                      <a:fillRect/>
+                    </a:stretch>
+                  </pic:blipFill>
+                  <pic:spPr>
+                    <a:xfrm>
+                      <a:off x="0" y="0"/>
+                      <a:ext cx="5940425" cy="361315"/>
+                    </a:xfrm>
+                    <a:prstGeom prst="rect">
+                      <a:avLst/>
+                    </a:prstGeom>
+                  </pic:spPr>
+                </pic:pic>
+              </a:graphicData>
+            </a:graphic>
+          </wp:inline>
+        </w:drawing>
+      </w:r>
+    </w:p>
+    <w:p>
+      <w:pPr>
+        <w:jc w:val="center"/>
+        <w:rPr>
+          <w:rFonts w:ascii="Times New Roman" w:hAnsi="Times New Roman" w:cs="Times New Roman"/>
+          <w:sz w:val="20"/>
+          <w:szCs w:val="20"/>
+        </w:rPr>
+      </w:pPr>
+      <w:r>
+        <w:rPr>
+          <w:rFonts w:ascii="Times New Roman" w:hAnsi="Times New Roman" w:cs="Times New Roman"/>
+          <w:sz w:val="20"/>
+          <w:szCs w:val="20"/>
+        </w:rPr>
+        <w:t xml:space="preserve">Генерация конфиг файла </w:t>
+      </w:r>
+    </w:p>
+    <w:p>
+      <w:pPr>
+        <w:jc w:val="both"/>
+        <w:rPr>
+          <w:rFonts w:ascii="Times New Roman" w:hAnsi="Times New Roman" w:cs="Times New Roman"/>
+          <w:sz w:val="20"/>
+          <w:szCs w:val="20"/>
+        </w:rPr>
+      </w:pPr>
+    </w:p>
+    <w:p>
+      <w:pPr>
+        <w:jc w:val="both"/>
+        <w:rPr>
+          <w:rFonts w:ascii="Times New Roman" w:hAnsi="Times New Roman" w:cs="Times New Roman"/>
+          <w:sz w:val="28"/>
+          <w:szCs w:val="28"/>
+        </w:rPr>
+      </w:pPr>
+      <w:r>
+        <w:rPr>
+          <w:rFonts w:ascii="Times New Roman" w:hAnsi="Times New Roman" w:cs="Times New Roman"/>
+          <w:sz w:val="28"/>
+          <w:szCs w:val="28"/>
+        </w:rPr>
+        <w:t>По умолчанию containerd использует собственный обработчик cgroups</w:t>
+      </w:r>
+      <w:r>
+        <w:rPr>
+          <w:rFonts w:ascii="Times New Roman" w:hAnsi="Times New Roman" w:cs="Times New Roman"/>
+          <w:sz w:val="28"/>
+          <w:szCs w:val="28"/>
+        </w:rPr>
+        <w:t xml:space="preserve">. </w:t>
+      </w:r>
+      <w:r>
+        <w:rPr>
+          <w:rFonts w:ascii="Times New Roman" w:hAnsi="Times New Roman" w:cs="Times New Roman"/>
+          <w:sz w:val="28"/>
+          <w:szCs w:val="28"/>
+        </w:rPr>
+        <w:t xml:space="preserve">Однако Ubuntu использует systemd. </w:t>
+      </w:r>
+      <w:r>
+        <w:rPr>
+          <w:rFonts w:ascii="Times New Roman" w:hAnsi="Times New Roman" w:cs="Times New Roman"/>
+          <w:sz w:val="28"/>
+          <w:szCs w:val="28"/>
+        </w:rPr>
+        <w:t xml:space="preserve">Из-за различий служб </w:t>
+      </w:r>
+      <w:r>
+        <w:rPr>
+          <w:rFonts w:ascii="Times New Roman" w:hAnsi="Times New Roman" w:cs="Times New Roman"/>
+          <w:sz w:val="28"/>
+          <w:szCs w:val="28"/>
+        </w:rPr>
+        <w:t>возникнет конфликт распределения ресурсов, и служба kubelet будет постоянно аварийно завершаться</w:t>
+      </w:r>
+      <w:r>
+        <w:rPr>
+          <w:rFonts w:ascii="Times New Roman" w:hAnsi="Times New Roman" w:cs="Times New Roman"/>
+          <w:sz w:val="28"/>
+          <w:szCs w:val="28"/>
+        </w:rPr>
+        <w:t xml:space="preserve">. Поэтому в конфиг файле изменим </w:t>
+      </w:r>
+      <w:r>
+        <w:rPr>
+          <w:rFonts w:ascii="Times New Roman" w:hAnsi="Times New Roman" w:cs="Times New Roman"/>
+          <w:sz w:val="28"/>
+          <w:szCs w:val="28"/>
+        </w:rPr>
+        <w:t>значение параметра SystemdCgroup с false на true</w:t>
+      </w:r>
+      <w:r>
+        <w:rPr>
+          <w:rFonts w:ascii="Times New Roman" w:hAnsi="Times New Roman" w:cs="Times New Roman"/>
+          <w:sz w:val="28"/>
+          <w:szCs w:val="28"/>
+        </w:rPr>
+        <w:t xml:space="preserve"> командой </w:t>
+      </w:r>
+    </w:p>
+    <w:p>
+      <w:pPr>
+        <w:jc w:val="both"/>
+        <w:rPr>
+          <w:rFonts w:ascii="Times New Roman" w:hAnsi="Times New Roman" w:cs="Times New Roman"/>
+          <w:i/>
+          <w:iCs/>
+          <w:sz w:val="24"/>
+          <w:szCs w:val="24"/>
+          <w:lang w:val="en-US"/>
+        </w:rPr>
+      </w:pPr>
+      <w:r>
+        <w:rPr>
+          <w:rFonts w:ascii="Times New Roman" w:hAnsi="Times New Roman" w:cs="Times New Roman"/>
+          <w:i/>
+          <w:iCs/>
+          <w:sz w:val="24"/>
+          <w:szCs w:val="24"/>
+          <w:lang w:val="en-US"/>
+        </w:rPr>
+        <w:t>sed -i 's/SystemdCgroup</w:t>
+      </w:r>
+      <w:r>
+        <w:rPr>
+          <w:rFonts w:ascii="Times New Roman" w:hAnsi="Times New Roman" w:cs="Times New Roman"/>
+          <w:i/>
+          <w:iCs/>
+          <w:sz w:val="24"/>
+          <w:szCs w:val="24"/>
+          <w:lang w:val="en-US"/>
+        </w:rPr>
+        <w:t xml:space="preserve"> </w:t>
+      </w:r>
+      <w:r>
+        <w:rPr>
+          <w:rFonts w:ascii="Times New Roman" w:hAnsi="Times New Roman" w:cs="Times New Roman"/>
+          <w:i/>
+          <w:iCs/>
+          <w:sz w:val="24"/>
+          <w:szCs w:val="24"/>
+          <w:lang w:val="en-US"/>
+        </w:rPr>
+        <w:t>= false/SystemdCgroup = true/g' /etc/containerd/config.toml</w:t>
+      </w:r>
+      <w:r>
+        <w:rPr>
+          <w:rFonts w:ascii="Times New Roman" w:hAnsi="Times New Roman" w:cs="Times New Roman"/>
+          <w:i/>
+          <w:iCs/>
+          <w:sz w:val="24"/>
+          <w:szCs w:val="24"/>
+          <w:lang w:val="en-US"/>
+        </w:rPr>
+        <w:t xml:space="preserve">. </w:t>
+      </w:r>
+    </w:p>
+    <w:p>
+      <w:pPr>
+        <w:jc w:val="both"/>
+        <w:rPr>
+          <w:rFonts w:ascii="Times New Roman" w:hAnsi="Times New Roman" w:cs="Times New Roman"/>
+          <w:sz w:val="28"/>
+          <w:szCs w:val="28"/>
+        </w:rPr>
+      </w:pPr>
+      <w:r>
+        <w:rPr>
+          <w:rFonts w:ascii="Times New Roman" w:hAnsi="Times New Roman" w:cs="Times New Roman"/>
+          <w:sz w:val="28"/>
+          <w:szCs w:val="28"/>
+        </w:rPr>
+        <w:t>Делаем так на всех узлах.</w:t>
+      </w:r>
+      <w:r>
+        <w:rPr>
+          <w:rFonts w:ascii="Times New Roman" w:hAnsi="Times New Roman" w:cs="Times New Roman"/>
+          <w:sz w:val="28"/>
+          <w:szCs w:val="28"/>
+        </w:rPr>
+        <w:t xml:space="preserve"> </w:t>
+      </w:r>
+      <w:r>
+        <w:rPr>
+          <w:rFonts w:ascii="Times New Roman" w:hAnsi="Times New Roman" w:cs="Times New Roman"/>
+          <w:sz w:val="28"/>
+          <w:szCs w:val="28"/>
+        </w:rPr>
+        <w:t xml:space="preserve">Затем устанавливаем </w:t>
+      </w:r>
+      <w:r>
+        <w:rPr>
+          <w:rFonts w:ascii="Times New Roman" w:hAnsi="Times New Roman" w:cs="Times New Roman"/>
+          <w:sz w:val="28"/>
+          <w:szCs w:val="28"/>
+        </w:rPr>
+        <w:t xml:space="preserve">на узлы </w:t>
+      </w:r>
+      <w:r>
+        <w:rPr>
+          <w:rFonts w:ascii="Times New Roman" w:hAnsi="Times New Roman" w:cs="Times New Roman"/>
+          <w:sz w:val="28"/>
+          <w:szCs w:val="28"/>
+          <w:lang w:val="en-US"/>
+        </w:rPr>
+        <w:t>k</w:t>
+      </w:r>
+      <w:r>
+        <w:rPr>
+          <w:rFonts w:ascii="Times New Roman" w:hAnsi="Times New Roman" w:cs="Times New Roman"/>
+          <w:sz w:val="28"/>
+          <w:szCs w:val="28"/>
+        </w:rPr>
+        <w:t>8</w:t>
+      </w:r>
+      <w:r>
+        <w:rPr>
+          <w:rFonts w:ascii="Times New Roman" w:hAnsi="Times New Roman" w:cs="Times New Roman"/>
+          <w:sz w:val="28"/>
+          <w:szCs w:val="28"/>
+          <w:lang w:val="en-US"/>
+        </w:rPr>
+        <w:t>s</w:t>
+      </w:r>
+      <w:r>
+        <w:rPr>
+          <w:rFonts w:ascii="Times New Roman" w:hAnsi="Times New Roman" w:cs="Times New Roman"/>
+          <w:sz w:val="28"/>
+          <w:szCs w:val="28"/>
+        </w:rPr>
+        <w:t xml:space="preserve"> </w:t>
+      </w:r>
+      <w:r>
+        <w:rPr>
+          <w:rFonts w:ascii="Times New Roman" w:hAnsi="Times New Roman" w:cs="Times New Roman"/>
+          <w:sz w:val="28"/>
+          <w:szCs w:val="28"/>
+          <w:lang w:val="en-US"/>
+        </w:rPr>
+        <w:t>v</w:t>
+      </w:r>
+      <w:r>
+        <w:rPr>
+          <w:rFonts w:ascii="Times New Roman" w:hAnsi="Times New Roman" w:cs="Times New Roman"/>
+          <w:sz w:val="28"/>
+          <w:szCs w:val="28"/>
+        </w:rPr>
+        <w:t xml:space="preserve">1.33: </w:t>
+      </w:r>
+      <w:r>
+        <w:rPr>
+          <w:rFonts w:ascii="Times New Roman" w:hAnsi="Times New Roman" w:cs="Times New Roman"/>
+          <w:sz w:val="28"/>
+          <w:szCs w:val="28"/>
+        </w:rPr>
+        <w:t>kubeadm, kubectl, kubelet</w:t>
+      </w:r>
+      <w:r>
+        <w:rPr>
+          <w:rFonts w:ascii="Times New Roman" w:hAnsi="Times New Roman" w:cs="Times New Roman"/>
+          <w:sz w:val="28"/>
+          <w:szCs w:val="28"/>
+        </w:rPr>
+        <w:t>.</w:t>
+      </w:r>
+      <w:r>
+        <w:rPr>
+          <w:rFonts w:ascii="Times New Roman" w:hAnsi="Times New Roman" w:cs="Times New Roman"/>
+          <w:sz w:val="28"/>
+          <w:szCs w:val="28"/>
+        </w:rPr>
+        <w:t xml:space="preserve"> </w:t>
+      </w:r>
+      <w:r>
+        <w:rPr>
+          <w:rFonts w:ascii="Times New Roman" w:hAnsi="Times New Roman" w:cs="Times New Roman"/>
+          <w:sz w:val="28"/>
+          <w:szCs w:val="28"/>
+        </w:rPr>
+        <w:t xml:space="preserve">Также установим </w:t>
+      </w:r>
+      <w:r>
+        <w:rPr>
+          <w:rFonts w:ascii="Times New Roman" w:hAnsi="Times New Roman" w:cs="Times New Roman"/>
+          <w:sz w:val="28"/>
+          <w:szCs w:val="28"/>
+          <w:lang w:val="en-US"/>
+        </w:rPr>
+        <w:t>nfs</w:t>
+      </w:r>
+      <w:r>
+        <w:rPr>
+          <w:rFonts w:ascii="Times New Roman" w:hAnsi="Times New Roman" w:cs="Times New Roman"/>
+          <w:sz w:val="28"/>
+          <w:szCs w:val="28"/>
+        </w:rPr>
+        <w:t>-</w:t>
+      </w:r>
+      <w:r>
+        <w:rPr>
+          <w:rFonts w:ascii="Times New Roman" w:hAnsi="Times New Roman" w:cs="Times New Roman"/>
+          <w:sz w:val="28"/>
+          <w:szCs w:val="28"/>
+          <w:lang w:val="en-US"/>
+        </w:rPr>
+        <w:t>client</w:t>
+      </w:r>
+      <w:r>
+        <w:rPr>
+          <w:rFonts w:ascii="Times New Roman" w:hAnsi="Times New Roman" w:cs="Times New Roman"/>
+          <w:sz w:val="28"/>
+          <w:szCs w:val="28"/>
+        </w:rPr>
+        <w:t xml:space="preserve"> </w:t>
+      </w:r>
+      <w:r>
+        <w:rPr>
+          <w:rFonts w:ascii="Times New Roman" w:hAnsi="Times New Roman" w:cs="Times New Roman"/>
+          <w:sz w:val="28"/>
+          <w:szCs w:val="28"/>
+        </w:rPr>
+        <w:t xml:space="preserve">на все узлы и </w:t>
+      </w:r>
+      <w:r>
+        <w:rPr>
+          <w:rFonts w:ascii="Times New Roman" w:hAnsi="Times New Roman" w:cs="Times New Roman"/>
+          <w:sz w:val="28"/>
+          <w:szCs w:val="28"/>
+          <w:lang w:val="en-US"/>
+        </w:rPr>
+        <w:t>nfs</w:t>
+      </w:r>
+      <w:r>
+        <w:rPr>
+          <w:rFonts w:ascii="Times New Roman" w:hAnsi="Times New Roman" w:cs="Times New Roman"/>
+          <w:sz w:val="28"/>
+          <w:szCs w:val="28"/>
+        </w:rPr>
+        <w:t>-</w:t>
+      </w:r>
+      <w:r>
+        <w:rPr>
+          <w:rFonts w:ascii="Times New Roman" w:hAnsi="Times New Roman" w:cs="Times New Roman"/>
+          <w:sz w:val="28"/>
+          <w:szCs w:val="28"/>
+          <w:lang w:val="en-US"/>
+        </w:rPr>
+        <w:t>server</w:t>
+      </w:r>
+      <w:r>
+        <w:rPr>
+          <w:rFonts w:ascii="Times New Roman" w:hAnsi="Times New Roman" w:cs="Times New Roman"/>
+          <w:sz w:val="28"/>
+          <w:szCs w:val="28"/>
+        </w:rPr>
+        <w:t xml:space="preserve"> </w:t>
+      </w:r>
+      <w:r>
+        <w:rPr>
+          <w:rFonts w:ascii="Times New Roman" w:hAnsi="Times New Roman" w:cs="Times New Roman"/>
+          <w:sz w:val="28"/>
+          <w:szCs w:val="28"/>
+        </w:rPr>
+        <w:t xml:space="preserve">на главный узел </w:t>
+      </w:r>
+      <w:r>
+        <w:rPr>
+          <w:rFonts w:ascii="Times New Roman" w:hAnsi="Times New Roman" w:cs="Times New Roman"/>
+          <w:sz w:val="28"/>
+          <w:szCs w:val="28"/>
+          <w:lang w:val="en-US"/>
+        </w:rPr>
+        <w:t>kube</w:t>
+      </w:r>
+      <w:r>
+        <w:rPr>
+          <w:rFonts w:ascii="Times New Roman" w:hAnsi="Times New Roman" w:cs="Times New Roman"/>
+          <w:sz w:val="28"/>
+          <w:szCs w:val="28"/>
+        </w:rPr>
+        <w:t xml:space="preserve">1. </w:t>
+      </w:r>
+    </w:p>
+    <w:p>
+      <w:pPr>
+        <w:jc w:val="both"/>
+        <w:rPr>
+          <w:rFonts w:ascii="Times New Roman" w:hAnsi="Times New Roman" w:cs="Times New Roman"/>
+          <w:sz w:val="28"/>
+          <w:szCs w:val="28"/>
+        </w:rPr>
+      </w:pPr>
+    </w:p>
+    <w:p>
+      <w:pPr>
+        <w:rPr>
+          <w:rFonts w:ascii="Times New Roman" w:hAnsi="Times New Roman" w:cs="Times New Roman"/>
+          <w:sz w:val="20"/>
+          <w:szCs w:val="20"/>
         </w:rPr>
       </w:pPr>
     </w:p>

</xml_diff>